<commit_message>
Régénère les diagrammes drawio et met à jour la présentation
- Architecture, ERD, MongoDB et structure du code régénérés depuis le code :
  write-back fraud_indicators, RGPD, requêtes, Terraform, sans chevauchements
- Images remplacées dans la présentation et les deux documents Word
- Identifiants de démo du dashboard dans la présentation, le README,
  la documentation et le script vidéo
</commit_message>
<xml_diff>
--- a/presentation/stripe_architecture_bloc2.docx
+++ b/presentation/stripe_architecture_bloc2.docx
@@ -2070,7 +2070,7 @@
       <w:r>
         <w:drawing>
           <wp:inline distT="0" distB="0" distL="0" distR="0">
-            <wp:extent cx="5715000" cy="3762375"/>
+            <wp:extent cx="5715000" cy="3857625"/>
             <wp:effectExtent t="0" r="0" b="0" l="0"/>
             <wp:docPr id="1" name="Figure 1 — Architecture globale telle qu’implémentée (presentation/stripe_architecture_globale.drawio)" descr="Figure 1 — Architecture globale telle qu’implémentée (presentation/stripe_architecture_globale.drawio)" title="Figure 1 — Architecture globale telle qu’implémentée (presentation/stripe_architecture_globale.drawio)"/>
             <wp:cNvGraphicFramePr>
@@ -2095,7 +2095,7 @@
                   <pic:spPr bwMode="auto">
                     <a:xfrm>
                       <a:off x="0" y="0"/>
-                      <a:ext cx="5715000" cy="3762375"/>
+                      <a:ext cx="5715000" cy="3857625"/>
                     </a:xfrm>
                     <a:prstGeom prst="rect">
                       <a:avLst/>
@@ -3419,7 +3419,7 @@
       <w:r>
         <w:drawing>
           <wp:inline distT="0" distB="0" distL="0" distR="0">
-            <wp:extent cx="5715000" cy="2762250"/>
+            <wp:extent cx="5715000" cy="3829050"/>
             <wp:effectExtent t="0" r="0" b="0" l="0"/>
             <wp:docPr id="1" name="Figure 2 — Modèle entité-association OLTP (presentation/stripe_erd_oltp.drawio)" descr="Figure 2 — Modèle entité-association OLTP (presentation/stripe_erd_oltp.drawio)" title="Figure 2 — Modèle entité-association OLTP (presentation/stripe_erd_oltp.drawio)"/>
             <wp:cNvGraphicFramePr>
@@ -3444,7 +3444,7 @@
                   <pic:spPr bwMode="auto">
                     <a:xfrm>
                       <a:off x="0" y="0"/>
-                      <a:ext cx="5715000" cy="2762250"/>
+                      <a:ext cx="5715000" cy="3829050"/>
                     </a:xfrm>
                     <a:prstGeom prst="rect">
                       <a:avLst/>
@@ -8006,7 +8006,7 @@
       <w:r>
         <w:drawing>
           <wp:inline distT="0" distB="0" distL="0" distR="0">
-            <wp:extent cx="5715000" cy="2581275"/>
+            <wp:extent cx="5715000" cy="3267075"/>
             <wp:effectExtent t="0" r="0" b="0" l="0"/>
             <wp:docPr id="1" name="Figure 3 — Structure MongoDB (presentation/stripe_mongodb_structure.drawio)" descr="Figure 3 — Structure MongoDB (presentation/stripe_mongodb_structure.drawio)" title="Figure 3 — Structure MongoDB (presentation/stripe_mongodb_structure.drawio)"/>
             <wp:cNvGraphicFramePr>
@@ -8031,7 +8031,7 @@
                   <pic:spPr bwMode="auto">
                     <a:xfrm>
                       <a:off x="0" y="0"/>
-                      <a:ext cx="5715000" cy="2581275"/>
+                      <a:ext cx="5715000" cy="3267075"/>
                     </a:xfrm>
                     <a:prstGeom prst="rect">
                       <a:avLst/>
@@ -9836,7 +9836,7 @@
         <w:spacing w:after="60" w:line="276"/>
       </w:pPr>
       <w:r>
-        <w:t xml:space="preserve">Le dashboard Streamlit, protégé par login, lit PostgreSQL (rôle </w:t>
+        <w:t xml:space="preserve">Le dashboard Streamlit (http://localhost:8501), protégé par login, lit PostgreSQL (rôle </w:t>
       </w:r>
       <w:r>
         <w:rPr>
@@ -9848,7 +9848,17 @@
         <w:t xml:space="preserve">analytics_reader</w:t>
       </w:r>
       <w:r>
-        <w:t xml:space="preserve">), MongoDB et Redis.</w:t>
+        <w:t xml:space="preserve">), MongoDB et Redis. Connexion de démo : </w:t>
+      </w:r>
+      <w:r>
+        <w:rPr>
+          <w:b/>
+          <w:bCs/>
+        </w:rPr>
+        <w:t xml:space="preserve">admin / Bloc2-Demo-2026</w:t>
+      </w:r>
+      <w:r>
+        <w:t xml:space="preserve"> (identifiants de démo locale, seul le hash SHA-256 est stocké).</w:t>
       </w:r>
     </w:p>
     <w:p>

</xml_diff>

<commit_message>
Complète les documents Word et la présentation avec tout le périmètre livré
- Architecture : section 5.6 sur le dashboard (connexion de démo, onglets
  Vue d'ensemble et Performance ML), job lint détaillé, figure 5 structure du code
- Compétences : incident du login Docker, requêtes et dashboard dans la
  documentation, figure de structure du code, identifiants de démo (C7)
- Présentation : nouvelle slide « Qualité, données et restitution »
  (tests 16/16, requêtes, RGPD, fraud_indicators, dashboard et MLOps)
</commit_message>
<xml_diff>
--- a/presentation/stripe_architecture_bloc2.docx
+++ b/presentation/stripe_architecture_bloc2.docx
@@ -10118,6 +10118,427 @@
     </w:p>
     <w:p>
       <w:pPr>
+        <w:pStyle w:val="Heading2"/>
+      </w:pPr>
+      <w:r>
+        <w:t xml:space="preserve">5.6 Restitution : le dashboard</w:t>
+      </w:r>
+    </w:p>
+    <w:p>
+      <w:pPr>
+        <w:spacing w:after="140" w:line="288"/>
+      </w:pPr>
+      <w:r>
+        <w:rPr>
+          <w:rFonts w:ascii="Consolas" w:cs="Consolas" w:eastAsia="Consolas" w:hAnsi="Consolas"/>
+          <w:color w:val="3B3F8F"/>
+          <w:sz w:val="19"/>
+          <w:szCs w:val="19"/>
+        </w:rPr>
+        <w:t xml:space="preserve">dashboard/app.py</w:t>
+      </w:r>
+      <w:r>
+        <w:t xml:space="preserve"> (Streamlit, http://localhost:8501) exige une connexion avant d’afficher la moindre donnée. Identifiants de démo locale : </w:t>
+      </w:r>
+      <w:r>
+        <w:rPr>
+          <w:b/>
+          <w:bCs/>
+        </w:rPr>
+        <w:t xml:space="preserve">admin / Bloc2-Demo-2026</w:t>
+      </w:r>
+      <w:r>
+        <w:t xml:space="preserve">. Seul le hash SHA-256 est stocké ; </w:t>
+      </w:r>
+      <w:r>
+        <w:rPr>
+          <w:rFonts w:ascii="Consolas" w:cs="Consolas" w:eastAsia="Consolas" w:hAnsi="Consolas"/>
+          <w:color w:val="3B3F8F"/>
+          <w:sz w:val="19"/>
+          <w:szCs w:val="19"/>
+        </w:rPr>
+        <w:t xml:space="preserve">docker-compose.yml</w:t>
+      </w:r>
+      <w:r>
+        <w:t xml:space="preserve"> le transmet au conteneur (variables </w:t>
+      </w:r>
+      <w:r>
+        <w:rPr>
+          <w:rFonts w:ascii="Consolas" w:cs="Consolas" w:eastAsia="Consolas" w:hAnsi="Consolas"/>
+          <w:color w:val="3B3F8F"/>
+          <w:sz w:val="19"/>
+          <w:szCs w:val="19"/>
+        </w:rPr>
+        <w:t xml:space="preserve">DASHBOARD_*</w:t>
+      </w:r>
+      <w:r>
+        <w:t xml:space="preserve">) et le compte est verrouillé 60 s après 5 échecs.</w:t>
+      </w:r>
+    </w:p>
+    <w:tbl>
+      <w:tblPr>
+        <w:tblW w:type="dxa" w:w="9026"/>
+        <w:tblBorders>
+          <w:top w:val="single" w:color="auto" w:sz="4"/>
+          <w:left w:val="single" w:color="auto" w:sz="4"/>
+          <w:bottom w:val="single" w:color="auto" w:sz="4"/>
+          <w:right w:val="single" w:color="auto" w:sz="4"/>
+          <w:insideH w:val="single" w:color="auto" w:sz="4"/>
+          <w:insideV w:val="single" w:color="auto" w:sz="4"/>
+        </w:tblBorders>
+      </w:tblPr>
+      <w:tblGrid>
+        <w:gridCol w:w="1624"/>
+        <w:gridCol w:w="4693"/>
+        <w:gridCol w:w="2709"/>
+      </w:tblGrid>
+      <w:tr>
+        <w:trPr>
+          <w:tblHeader/>
+        </w:trPr>
+        <w:tc>
+          <w:tcPr>
+            <w:tcW w:type="dxa" w:w="1624"/>
+            <w:tcBorders>
+              <w:top w:val="single" w:color="D5D8E3" w:sz="4"/>
+              <w:left w:val="single" w:color="D5D8E3" w:sz="4"/>
+              <w:bottom w:val="single" w:color="D5D8E3" w:sz="4"/>
+              <w:right w:val="single" w:color="D5D8E3" w:sz="4"/>
+            </w:tcBorders>
+            <w:shd w:fill="6C63FF" w:val="clear"/>
+            <w:tcMar>
+              <w:top w:type="dxa" w:w="60"/>
+              <w:left w:type="dxa" w:w="100"/>
+              <w:bottom w:type="dxa" w:w="60"/>
+              <w:right w:type="dxa" w:w="100"/>
+            </w:tcMar>
+          </w:tcPr>
+          <w:p>
+            <w:pPr>
+              <w:spacing w:after="20"/>
+            </w:pPr>
+            <w:r>
+              <w:rPr>
+                <w:b/>
+                <w:bCs/>
+                <w:color w:val="FFFFFF"/>
+                <w:sz w:val="18"/>
+                <w:szCs w:val="18"/>
+              </w:rPr>
+              <w:t xml:space="preserve">Onglet</w:t>
+            </w:r>
+          </w:p>
+        </w:tc>
+        <w:tc>
+          <w:tcPr>
+            <w:tcW w:type="dxa" w:w="4693"/>
+            <w:tcBorders>
+              <w:top w:val="single" w:color="D5D8E3" w:sz="4"/>
+              <w:left w:val="single" w:color="D5D8E3" w:sz="4"/>
+              <w:bottom w:val="single" w:color="D5D8E3" w:sz="4"/>
+              <w:right w:val="single" w:color="D5D8E3" w:sz="4"/>
+            </w:tcBorders>
+            <w:shd w:fill="6C63FF" w:val="clear"/>
+            <w:tcMar>
+              <w:top w:type="dxa" w:w="60"/>
+              <w:left w:type="dxa" w:w="100"/>
+              <w:bottom w:type="dxa" w:w="60"/>
+              <w:right w:type="dxa" w:w="100"/>
+            </w:tcMar>
+          </w:tcPr>
+          <w:p>
+            <w:pPr>
+              <w:spacing w:after="20"/>
+            </w:pPr>
+            <w:r>
+              <w:rPr>
+                <w:b/>
+                <w:bCs/>
+                <w:color w:val="FFFFFF"/>
+                <w:sz w:val="18"/>
+                <w:szCs w:val="18"/>
+              </w:rPr>
+              <w:t xml:space="preserve">Contenu</w:t>
+            </w:r>
+          </w:p>
+        </w:tc>
+        <w:tc>
+          <w:tcPr>
+            <w:tcW w:type="dxa" w:w="2709"/>
+            <w:tcBorders>
+              <w:top w:val="single" w:color="D5D8E3" w:sz="4"/>
+              <w:left w:val="single" w:color="D5D8E3" w:sz="4"/>
+              <w:bottom w:val="single" w:color="D5D8E3" w:sz="4"/>
+              <w:right w:val="single" w:color="D5D8E3" w:sz="4"/>
+            </w:tcBorders>
+            <w:shd w:fill="6C63FF" w:val="clear"/>
+            <w:tcMar>
+              <w:top w:type="dxa" w:w="60"/>
+              <w:left w:type="dxa" w:w="100"/>
+              <w:bottom w:type="dxa" w:w="60"/>
+              <w:right w:type="dxa" w:w="100"/>
+            </w:tcMar>
+          </w:tcPr>
+          <w:p>
+            <w:pPr>
+              <w:spacing w:after="20"/>
+            </w:pPr>
+            <w:r>
+              <w:rPr>
+                <w:b/>
+                <w:bCs/>
+                <w:color w:val="FFFFFF"/>
+                <w:sz w:val="18"/>
+                <w:szCs w:val="18"/>
+              </w:rPr>
+              <w:t xml:space="preserve">Source</w:t>
+            </w:r>
+          </w:p>
+        </w:tc>
+      </w:tr>
+      <w:tr>
+        <w:tc>
+          <w:tcPr>
+            <w:tcW w:type="dxa" w:w="1624"/>
+            <w:tcBorders>
+              <w:top w:val="single" w:color="D5D8E3" w:sz="4"/>
+              <w:left w:val="single" w:color="D5D8E3" w:sz="4"/>
+              <w:bottom w:val="single" w:color="D5D8E3" w:sz="4"/>
+              <w:right w:val="single" w:color="D5D8E3" w:sz="4"/>
+            </w:tcBorders>
+            <w:tcMar>
+              <w:top w:type="dxa" w:w="60"/>
+              <w:left w:type="dxa" w:w="100"/>
+              <w:bottom w:type="dxa" w:w="60"/>
+              <w:right w:type="dxa" w:w="100"/>
+            </w:tcMar>
+          </w:tcPr>
+          <w:p>
+            <w:pPr>
+              <w:spacing w:after="20"/>
+            </w:pPr>
+            <w:r>
+              <w:rPr>
+                <w:sz w:val="18"/>
+                <w:szCs w:val="18"/>
+              </w:rPr>
+              <w:t xml:space="preserve">Vue d’ensemble</w:t>
+            </w:r>
+          </w:p>
+        </w:tc>
+        <w:tc>
+          <w:tcPr>
+            <w:tcW w:type="dxa" w:w="4693"/>
+            <w:tcBorders>
+              <w:top w:val="single" w:color="D5D8E3" w:sz="4"/>
+              <w:left w:val="single" w:color="D5D8E3" w:sz="4"/>
+              <w:bottom w:val="single" w:color="D5D8E3" w:sz="4"/>
+              <w:right w:val="single" w:color="D5D8E3" w:sz="4"/>
+            </w:tcBorders>
+            <w:tcMar>
+              <w:top w:type="dxa" w:w="60"/>
+              <w:left w:type="dxa" w:w="100"/>
+              <w:bottom w:type="dxa" w:w="60"/>
+              <w:right w:type="dxa" w:w="100"/>
+            </w:tcMar>
+          </w:tcPr>
+          <w:p>
+            <w:pPr>
+              <w:spacing w:after="20"/>
+            </w:pPr>
+            <w:r>
+              <w:rPr>
+                <w:sz w:val="18"/>
+                <w:szCs w:val="18"/>
+              </w:rPr>
+              <w:t xml:space="preserve">KPIs, volume par minute, fraude par pays, top marchands, alertes récentes, transactions à revoir, état du feature store</w:t>
+            </w:r>
+          </w:p>
+        </w:tc>
+        <w:tc>
+          <w:tcPr>
+            <w:tcW w:type="dxa" w:w="2709"/>
+            <w:tcBorders>
+              <w:top w:val="single" w:color="D5D8E3" w:sz="4"/>
+              <w:left w:val="single" w:color="D5D8E3" w:sz="4"/>
+              <w:bottom w:val="single" w:color="D5D8E3" w:sz="4"/>
+              <w:right w:val="single" w:color="D5D8E3" w:sz="4"/>
+            </w:tcBorders>
+            <w:tcMar>
+              <w:top w:type="dxa" w:w="60"/>
+              <w:left w:type="dxa" w:w="100"/>
+              <w:bottom w:type="dxa" w:w="60"/>
+              <w:right w:type="dxa" w:w="100"/>
+            </w:tcMar>
+          </w:tcPr>
+          <w:p>
+            <w:pPr>
+              <w:spacing w:after="20"/>
+            </w:pPr>
+            <w:r>
+              <w:rPr>
+                <w:sz w:val="18"/>
+                <w:szCs w:val="18"/>
+              </w:rPr>
+              <w:t xml:space="preserve">PostgreSQL (</w:t>
+            </w:r>
+            <w:r>
+              <w:rPr>
+                <w:rFonts w:ascii="Consolas" w:cs="Consolas" w:eastAsia="Consolas" w:hAnsi="Consolas"/>
+                <w:color w:val="3B3F8F"/>
+                <w:sz w:val="16"/>
+                <w:szCs w:val="16"/>
+              </w:rPr>
+              <w:t xml:space="preserve">analytics_reader</w:t>
+            </w:r>
+            <w:r>
+              <w:rPr>
+                <w:sz w:val="18"/>
+                <w:szCs w:val="18"/>
+              </w:rPr>
+              <w:t xml:space="preserve">), MongoDB </w:t>
+            </w:r>
+            <w:r>
+              <w:rPr>
+                <w:rFonts w:ascii="Consolas" w:cs="Consolas" w:eastAsia="Consolas" w:hAnsi="Consolas"/>
+                <w:color w:val="3B3F8F"/>
+                <w:sz w:val="16"/>
+                <w:szCs w:val="16"/>
+              </w:rPr>
+              <w:t xml:space="preserve">fraud_alerts</w:t>
+            </w:r>
+            <w:r>
+              <w:rPr>
+                <w:sz w:val="18"/>
+                <w:szCs w:val="18"/>
+              </w:rPr>
+              <w:t xml:space="preserve">, Redis</w:t>
+            </w:r>
+          </w:p>
+        </w:tc>
+      </w:tr>
+      <w:tr>
+        <w:tc>
+          <w:tcPr>
+            <w:tcW w:type="dxa" w:w="1624"/>
+            <w:tcBorders>
+              <w:top w:val="single" w:color="D5D8E3" w:sz="4"/>
+              <w:left w:val="single" w:color="D5D8E3" w:sz="4"/>
+              <w:bottom w:val="single" w:color="D5D8E3" w:sz="4"/>
+              <w:right w:val="single" w:color="D5D8E3" w:sz="4"/>
+            </w:tcBorders>
+            <w:tcMar>
+              <w:top w:type="dxa" w:w="60"/>
+              <w:left w:type="dxa" w:w="100"/>
+              <w:bottom w:type="dxa" w:w="60"/>
+              <w:right w:type="dxa" w:w="100"/>
+            </w:tcMar>
+          </w:tcPr>
+          <w:p>
+            <w:pPr>
+              <w:spacing w:after="20"/>
+            </w:pPr>
+            <w:r>
+              <w:rPr>
+                <w:sz w:val="18"/>
+                <w:szCs w:val="18"/>
+              </w:rPr>
+              <w:t xml:space="preserve">Performance ML</w:t>
+            </w:r>
+          </w:p>
+        </w:tc>
+        <w:tc>
+          <w:tcPr>
+            <w:tcW w:type="dxa" w:w="4693"/>
+            <w:tcBorders>
+              <w:top w:val="single" w:color="D5D8E3" w:sz="4"/>
+              <w:left w:val="single" w:color="D5D8E3" w:sz="4"/>
+              <w:bottom w:val="single" w:color="D5D8E3" w:sz="4"/>
+              <w:right w:val="single" w:color="D5D8E3" w:sz="4"/>
+            </w:tcBorders>
+            <w:tcMar>
+              <w:top w:type="dxa" w:w="60"/>
+              <w:left w:type="dxa" w:w="100"/>
+              <w:bottom w:type="dxa" w:w="60"/>
+              <w:right w:type="dxa" w:w="100"/>
+            </w:tcMar>
+          </w:tcPr>
+          <w:p>
+            <w:pPr>
+              <w:spacing w:after="20"/>
+            </w:pPr>
+            <w:r>
+              <w:rPr>
+                <w:sz w:val="18"/>
+                <w:szCs w:val="18"/>
+              </w:rPr>
+              <w:t xml:space="preserve">Statut du monitoring, part de colonnes en dérive, précision et rappel servis, historique des contrôles, scores par </w:t>
+            </w:r>
+            <w:r>
+              <w:rPr>
+                <w:rFonts w:ascii="Consolas" w:cs="Consolas" w:eastAsia="Consolas" w:hAnsi="Consolas"/>
+                <w:color w:val="3B3F8F"/>
+                <w:sz w:val="16"/>
+                <w:szCs w:val="16"/>
+              </w:rPr>
+              <w:t xml:space="preserve">model_version</w:t>
+            </w:r>
+          </w:p>
+        </w:tc>
+        <w:tc>
+          <w:tcPr>
+            <w:tcW w:type="dxa" w:w="2709"/>
+            <w:tcBorders>
+              <w:top w:val="single" w:color="D5D8E3" w:sz="4"/>
+              <w:left w:val="single" w:color="D5D8E3" w:sz="4"/>
+              <w:bottom w:val="single" w:color="D5D8E3" w:sz="4"/>
+              <w:right w:val="single" w:color="D5D8E3" w:sz="4"/>
+            </w:tcBorders>
+            <w:tcMar>
+              <w:top w:type="dxa" w:w="60"/>
+              <w:left w:type="dxa" w:w="100"/>
+              <w:bottom w:type="dxa" w:w="60"/>
+              <w:right w:type="dxa" w:w="100"/>
+            </w:tcMar>
+          </w:tcPr>
+          <w:p>
+            <w:pPr>
+              <w:spacing w:after="20"/>
+            </w:pPr>
+            <w:r>
+              <w:rPr>
+                <w:sz w:val="18"/>
+                <w:szCs w:val="18"/>
+              </w:rPr>
+              <w:t xml:space="preserve">MongoDB </w:t>
+            </w:r>
+            <w:r>
+              <w:rPr>
+                <w:rFonts w:ascii="Consolas" w:cs="Consolas" w:eastAsia="Consolas" w:hAnsi="Consolas"/>
+                <w:color w:val="3B3F8F"/>
+                <w:sz w:val="16"/>
+                <w:szCs w:val="16"/>
+              </w:rPr>
+              <w:t xml:space="preserve">ml_monitoring</w:t>
+            </w:r>
+            <w:r>
+              <w:rPr>
+                <w:sz w:val="18"/>
+                <w:szCs w:val="18"/>
+              </w:rPr>
+              <w:t xml:space="preserve">, PostgreSQL</w:t>
+            </w:r>
+          </w:p>
+        </w:tc>
+      </w:tr>
+    </w:tbl>
+    <w:p>
+      <w:pPr>
+        <w:spacing w:after="120"/>
+      </w:pPr>
+    </w:p>
+    <w:p>
+      <w:pPr>
         <w:pStyle w:val="Heading1"/>
         <w:pageBreakBefore/>
       </w:pPr>
@@ -14918,7 +15339,39 @@
                 <w:sz w:val="18"/>
                 <w:szCs w:val="18"/>
               </w:rPr>
-              <w:t xml:space="preserve">, </w:t>
+              <w:t xml:space="preserve"> (compilation Python, XML des diagrammes, </w:t>
+            </w:r>
+            <w:r>
+              <w:rPr>
+                <w:rFonts w:ascii="Consolas" w:cs="Consolas" w:eastAsia="Consolas" w:hAnsi="Consolas"/>
+                <w:color w:val="3B3F8F"/>
+                <w:sz w:val="16"/>
+                <w:szCs w:val="16"/>
+              </w:rPr>
+              <w:t xml:space="preserve">docker compose config</w:t>
+            </w:r>
+            <w:r>
+              <w:rPr>
+                <w:sz w:val="18"/>
+                <w:szCs w:val="18"/>
+              </w:rPr>
+              <w:t xml:space="preserve"> sur un </w:t>
+            </w:r>
+            <w:r>
+              <w:rPr>
+                <w:rFonts w:ascii="Consolas" w:cs="Consolas" w:eastAsia="Consolas" w:hAnsi="Consolas"/>
+                <w:color w:val="3B3F8F"/>
+                <w:sz w:val="16"/>
+                <w:szCs w:val="16"/>
+              </w:rPr>
+              <w:t xml:space="preserve">.env</w:t>
+            </w:r>
+            <w:r>
+              <w:rPr>
+                <w:sz w:val="18"/>
+                <w:szCs w:val="18"/>
+              </w:rPr>
+              <w:t xml:space="preserve"> jetable), </w:t>
             </w:r>
             <w:r>
               <w:rPr>
@@ -14960,6 +15413,77 @@
       <w:pPr>
         <w:spacing w:after="120"/>
       </w:pPr>
+    </w:p>
+    <w:p>
+      <w:pPr>
+        <w:spacing w:after="140" w:line="288"/>
+      </w:pPr>
+      <w:r>
+        <w:t xml:space="preserve">Les diagrammes (architecture, ERD, MongoDB, structure du code, cible AWS) sont générés par script à partir du DDL, des écritures réelles du code et des fichiers Terraform, puis régénérés à chaque évolution : ils ne peuvent pas diverger du dépôt sans que cela se voie.</w:t>
+      </w:r>
+    </w:p>
+    <w:p>
+      <w:pPr>
+        <w:keepNext/>
+        <w:spacing w:after="60" w:before="120"/>
+        <w:jc w:val="center"/>
+      </w:pPr>
+      <w:r>
+        <w:drawing>
+          <wp:inline distT="0" distB="0" distL="0" distR="0">
+            <wp:extent cx="5715000" cy="3314700"/>
+            <wp:effectExtent t="0" r="0" b="0" l="0"/>
+            <wp:docPr id="1" name="Figure 5 — Structure du code : fichiers et fonctions clés (presentation/stripe_code_structure.drawio)" descr="Figure 5 — Structure du code : fichiers et fonctions clés (presentation/stripe_code_structure.drawio)" title="Figure 5 — Structure du code : fichiers et fonctions clés (presentation/stripe_code_structure.drawio)"/>
+            <wp:cNvGraphicFramePr>
+              <a:graphicFrameLocks xmlns:a="http://schemas.openxmlformats.org/drawingml/2006/main" noChangeAspect="1"/>
+            </wp:cNvGraphicFramePr>
+            <a:graphic xmlns:a="http://schemas.openxmlformats.org/drawingml/2006/main">
+              <a:graphicData uri="http://schemas.openxmlformats.org/drawingml/2006/picture">
+                <pic:pic xmlns:pic="http://schemas.openxmlformats.org/drawingml/2006/picture">
+                  <pic:nvPicPr>
+                    <pic:cNvPr id="0" name="" descr=""/>
+                    <pic:cNvPicPr>
+                      <a:picLocks noChangeAspect="1" noChangeArrowheads="1"/>
+                    </pic:cNvPicPr>
+                  </pic:nvPicPr>
+                  <pic:blipFill>
+                    <a:blip r:embed="rId12" cstate="none"/>
+                    <a:srcRect/>
+                    <a:stretch>
+                      <a:fillRect/>
+                    </a:stretch>
+                  </pic:blipFill>
+                  <pic:spPr bwMode="auto">
+                    <a:xfrm>
+                      <a:off x="0" y="0"/>
+                      <a:ext cx="5715000" cy="3314700"/>
+                    </a:xfrm>
+                    <a:prstGeom prst="rect">
+                      <a:avLst/>
+                    </a:prstGeom>
+                  </pic:spPr>
+                </pic:pic>
+              </a:graphicData>
+            </a:graphic>
+          </wp:inline>
+        </w:drawing>
+      </w:r>
+    </w:p>
+    <w:p>
+      <w:pPr>
+        <w:spacing w:after="200"/>
+        <w:jc w:val="center"/>
+      </w:pPr>
+      <w:r>
+        <w:rPr>
+          <w:i/>
+          <w:iCs/>
+          <w:color w:val="5F6B7A"/>
+          <w:sz w:val="18"/>
+          <w:szCs w:val="18"/>
+        </w:rPr>
+        <w:t xml:space="preserve">Figure 5 — Structure du code : fichiers et fonctions clés (presentation/stripe_code_structure.drawio)</w:t>
+      </w:r>
     </w:p>
     <w:p>
       <w:pPr>
@@ -15999,7 +16523,7 @@
                     </pic:cNvPicPr>
                   </pic:nvPicPr>
                   <pic:blipFill>
-                    <a:blip r:embed="rId12" cstate="none"/>
+                    <a:blip r:embed="rId13" cstate="none"/>
                     <a:srcRect/>
                     <a:stretch>
                       <a:fillRect/>

</xml_diff>

<commit_message>
Métriques réalistes, retour arrière automatique des réentraînements, validité externe
Mesure du 25/09/2026 (90 min, 32 281 transactions, générateur réaliste) :
précision servie 0,88, rappel 0,64 ; par profil, card testing 80 % bloqué,
brutal 56 %, furtive 2,5 %. Le rappel servi a reculé de 0,82 à 0,40 au fil de
cinq réentraînements automatiques déclenchés par une dérive de vélocité.

- ml/monitor.py : retour arrière automatique (modèle rejeté si recall_at_block
  recule de plus de ML_ROLLBACK_TOLERANCE, ancien .pkl restauré)
- ml/train_fraud_model.py : minimum de 100 arbres après arrêt anticipé
- Documentation : résultats et section « Validité externe » (précision estimée
  à 12 % à un taux de fraude réel), post-mortem MLOPS §5.5, PRESENTATION,
  speech, slide 10, trois documents Word régénérés
</commit_message>
<xml_diff>
--- a/presentation/stripe_architecture_bloc2.docx
+++ b/presentation/stripe_architecture_bloc2.docx
@@ -13264,7 +13264,7 @@
         <w:pStyle w:val="Heading2"/>
       </w:pPr>
       <w:r>
-        <w:t xml:space="preserve">7.4 Résultats mesurés le 15/09/2026</w:t>
+        <w:t xml:space="preserve">7.4 Résultats mesurés le 25/09/2026</w:t>
       </w:r>
     </w:p>
     <w:tbl>
@@ -13448,7 +13448,7 @@
                 <w:sz w:val="18"/>
                 <w:szCs w:val="18"/>
               </w:rPr>
-              <w:t xml:space="preserve">Offline, entraînement de 15:53</w:t>
+              <w:t xml:space="preserve">Offline, seuil 0,5 (modèle du 07:38)</w:t>
             </w:r>
           </w:p>
         </w:tc>
@@ -13477,7 +13477,7 @@
                 <w:sz w:val="18"/>
                 <w:szCs w:val="18"/>
               </w:rPr>
-              <w:t xml:space="preserve">0,95</w:t>
+              <w:t xml:space="preserve">0,76</w:t>
             </w:r>
           </w:p>
         </w:tc>
@@ -13506,7 +13506,7 @@
                 <w:sz w:val="18"/>
                 <w:szCs w:val="18"/>
               </w:rPr>
-              <w:t xml:space="preserve">0,97</w:t>
+              <w:t xml:space="preserve">0,88</w:t>
             </w:r>
           </w:p>
         </w:tc>
@@ -13535,7 +13535,7 @@
                 <w:sz w:val="18"/>
                 <w:szCs w:val="18"/>
               </w:rPr>
-              <w:t xml:space="preserve">20 407 transactions de test, AUC 0,995</w:t>
+              <w:t xml:space="preserve">2 519 transactions de test, AUC 0,96, 117 arbres (arrêt anticipé)</w:t>
             </w:r>
           </w:p>
         </w:tc>
@@ -13566,7 +13566,7 @@
                 <w:sz w:val="18"/>
                 <w:szCs w:val="18"/>
               </w:rPr>
-              <w:t xml:space="preserve">Offline, réentraînement auto de 17:10</w:t>
+              <w:t xml:space="preserve">Offline, au seuil de blocage 0,85</w:t>
             </w:r>
           </w:p>
         </w:tc>
@@ -13595,7 +13595,7 @@
                 <w:sz w:val="18"/>
                 <w:szCs w:val="18"/>
               </w:rPr>
-              <w:t xml:space="preserve">0,77</w:t>
+              <w:t xml:space="preserve">0,89</w:t>
             </w:r>
           </w:p>
         </w:tc>
@@ -13624,7 +13624,7 @@
                 <w:sz w:val="18"/>
                 <w:szCs w:val="18"/>
               </w:rPr>
-              <w:t xml:space="preserve">0,97</w:t>
+              <w:t xml:space="preserve">0,80</w:t>
             </w:r>
           </w:p>
         </w:tc>
@@ -13653,7 +13653,7 @@
                 <w:sz w:val="18"/>
                 <w:szCs w:val="18"/>
               </w:rPr>
-              <w:t xml:space="preserve">21 744 transactions de test, fenêtre contenant un redémarrage de la stack</w:t>
+              <w:t xml:space="preserve">Même jeu de test : métrique comparable à la performance servie</w:t>
             </w:r>
           </w:p>
         </w:tc>
@@ -13693,7 +13693,7 @@
                 <w:sz w:val="18"/>
                 <w:szCs w:val="18"/>
               </w:rPr>
-              <w:t xml:space="preserve">, 17:00-17:12</w:t>
+              <w:t xml:space="preserve">, 07:40-09:10 (90 min)</w:t>
             </w:r>
           </w:p>
         </w:tc>
@@ -13724,7 +13724,7 @@
                 <w:sz w:val="18"/>
                 <w:szCs w:val="18"/>
               </w:rPr>
-              <w:t xml:space="preserve">0,93</w:t>
+              <w:t xml:space="preserve">0,88</w:t>
             </w:r>
           </w:p>
         </w:tc>
@@ -13755,7 +13755,7 @@
                 <w:sz w:val="18"/>
                 <w:szCs w:val="18"/>
               </w:rPr>
-              <w:t xml:space="preserve">0,96</w:t>
+              <w:t xml:space="preserve">0,64</w:t>
             </w:r>
           </w:p>
         </w:tc>
@@ -13784,7 +13784,7 @@
                 <w:sz w:val="18"/>
                 <w:szCs w:val="18"/>
               </w:rPr>
-              <w:t xml:space="preserve">1 225 vrais positifs, 92 faux positifs, 45 faux négatifs</w:t>
+              <w:t xml:space="preserve">32 281 transactions, 3 003 vrais positifs, 407 faux positifs, 1 680 faux négatifs, 1 758 en revue</w:t>
             </w:r>
           </w:p>
         </w:tc>
@@ -13809,7 +13809,39 @@
           <w:sz w:val="20"/>
           <w:szCs w:val="20"/>
         </w:rPr>
-        <w:t xml:space="preserve">Deux limites à connaître. (1) Les labels viennent du générateur synthétique ; en production, il faudrait des rétrofacturations (chargebacks) confirmées, qui arrivent 30 à 90 jours plus tard. (2) Le trafic scoré contient environ 25 % de fraude (rafales), contre 0,1 à 0,5 % dans la réalité : à rappel égal, la précision réelle serait plus basse. C’est pourquoi la précision servie est mesurée en continu, et pas seulement la métrique offline.</w:t>
+        <w:t xml:space="preserve">Trois choses à savoir. (1) Les labels viennent du générateur synthétique ; en production, il faudrait des rétrofacturations confirmées, qui arrivent 30 à 90 jours plus tard. (2) Le trafic scoré contient 14,5 % de fraude contre 0,1 à 0,5 % en réalité : à rappel et faux positifs constants, la précision tomberait vers 12 % sur un vrai flux. (3) Pendant la mesure, cinq réentraînements automatiques déclenchés par une dérive de vélocité ont fait reculer le rappel servi de 0,82 à 0,40 ; un retour arrière automatique a été ajouté à </w:t>
+      </w:r>
+      <w:r>
+        <w:rPr>
+          <w:rFonts w:ascii="Consolas" w:cs="Consolas" w:eastAsia="Consolas" w:hAnsi="Consolas"/>
+          <w:color w:val="3B3F8F"/>
+          <w:sz w:val="18"/>
+          <w:szCs w:val="18"/>
+        </w:rPr>
+        <w:t xml:space="preserve">ml/monitor.py</w:t>
+      </w:r>
+      <w:r>
+        <w:rPr>
+          <w:sz w:val="20"/>
+          <w:szCs w:val="20"/>
+        </w:rPr>
+        <w:t xml:space="preserve"> et le modèle de 07:38 restauré depuis le registre MLflow (</w:t>
+      </w:r>
+      <w:r>
+        <w:rPr>
+          <w:rFonts w:ascii="Consolas" w:cs="Consolas" w:eastAsia="Consolas" w:hAnsi="Consolas"/>
+          <w:color w:val="3B3F8F"/>
+          <w:sz w:val="18"/>
+          <w:szCs w:val="18"/>
+        </w:rPr>
+        <w:t xml:space="preserve">docs/MLOPS.md</w:t>
+      </w:r>
+      <w:r>
+        <w:rPr>
+          <w:sz w:val="20"/>
+          <w:szCs w:val="20"/>
+        </w:rPr>
+        <w:t xml:space="preserve"> §5.5).</w:t>
       </w:r>
     </w:p>
     <w:p>

</xml_diff>